<commit_message>
Amélioration de l'installation de l'application
</commit_message>
<xml_diff>
--- a/assets/document/installation.docx
+++ b/assets/document/installation.docx
@@ -1,31 +1,49 @@
 
 <file path=word/document.xml><?xml version="1.0" encoding="utf-8"?>
-<w:document xmlns:wpc="http://schemas.microsoft.com/office/word/2010/wordprocessingCanvas" xmlns:cx="http://schemas.microsoft.com/office/drawing/2014/chartex" xmlns:cx1="http://schemas.microsoft.com/office/drawing/2015/9/8/chartex" xmlns:cx2="http://schemas.microsoft.com/office/drawing/2015/10/21/chartex" xmlns:cx3="http://schemas.microsoft.com/office/drawing/2016/5/9/chartex" xmlns:cx4="http://schemas.microsoft.com/office/drawing/2016/5/10/chartex" xmlns:cx5="http://schemas.microsoft.com/office/drawing/2016/5/11/chartex" xmlns:cx6="http://schemas.microsoft.com/office/drawing/2016/5/12/chartex" xmlns:cx7="http://schemas.microsoft.com/office/drawing/2016/5/13/chartex" xmlns:cx8="http://schemas.microsoft.com/office/drawing/2016/5/14/chartex" xmlns:mc="http://schemas.openxmlformats.org/markup-compatibility/2006" xmlns:aink="http://schemas.microsoft.com/office/drawing/2016/ink" xmlns:am3d="http://schemas.microsoft.com/office/drawing/2017/model3d" xmlns:o="urn:schemas-microsoft-com:office:office" xmlns:oel="http://schemas.microsoft.com/office/2019/extlst" xmlns:r="http://schemas.openxmlformats.org/officeDocument/2006/relationships" xmlns:m="http://schemas.openxmlformats.org/officeDocument/2006/math" xmlns:v="urn:schemas-microsoft-com:vml" xmlns:wp14="http://schemas.microsoft.com/office/word/2010/wordprocessingDrawing" xmlns:wp="http://schemas.openxmlformats.org/drawingml/2006/wordprocessingDrawing" xmlns:w10="urn:schemas-microsoft-com:office:word" xmlns:w="http://schemas.openxmlformats.org/wordprocessingml/2006/main" xmlns:w14="http://schemas.microsoft.com/office/word/2010/wordml" xmlns:w15="http://schemas.microsoft.com/office/word/2012/wordml" xmlns:w16cex="http://schemas.microsoft.com/office/word/2018/wordml/cex" xmlns:w16cid="http://schemas.microsoft.com/office/word/2016/wordml/cid" xmlns:w16="http://schemas.microsoft.com/office/word/2018/wordml" xmlns:w16sdtdh="http://schemas.microsoft.com/office/word/2020/wordml/sdtdatahash" xmlns:w16se="http://schemas.microsoft.com/office/word/2015/wordml/symex" xmlns:wpg="http://schemas.microsoft.com/office/word/2010/wordprocessingGroup" xmlns:wpi="http://schemas.microsoft.com/office/word/2010/wordprocessingInk" xmlns:wne="http://schemas.microsoft.com/office/word/2006/wordml" xmlns:wps="http://schemas.microsoft.com/office/word/2010/wordprocessingShape" mc:Ignorable="w14 w15 w16se w16cid w16 w16cex w16sdtdh wp14">
+<w:document xmlns:wpc="http://schemas.microsoft.com/office/word/2010/wordprocessingCanvas" xmlns:mc="http://schemas.openxmlformats.org/markup-compatibility/2006" xmlns:o="urn:schemas-microsoft-com:office:office" xmlns:r="http://schemas.openxmlformats.org/officeDocument/2006/relationships" xmlns:m="http://schemas.openxmlformats.org/officeDocument/2006/math" xmlns:v="urn:schemas-microsoft-com:vml" xmlns:wp14="http://schemas.microsoft.com/office/word/2010/wordprocessingDrawing" xmlns:wp="http://schemas.openxmlformats.org/drawingml/2006/wordprocessingDrawing" xmlns:w10="urn:schemas-microsoft-com:office:word" xmlns:w="http://schemas.openxmlformats.org/wordprocessingml/2006/main" xmlns:w14="http://schemas.microsoft.com/office/word/2010/wordml" xmlns:w15="http://schemas.microsoft.com/office/word/2012/wordml" xmlns:wpg="http://schemas.microsoft.com/office/word/2010/wordprocessingGroup" xmlns:wpi="http://schemas.microsoft.com/office/word/2010/wordprocessingInk" xmlns:wne="http://schemas.microsoft.com/office/word/2006/wordml" xmlns:wps="http://schemas.microsoft.com/office/word/2010/wordprocessingShape" mc:Ignorable="w14 w15 wp14">
   <w:body>
     <w:p>
       <w:pPr>
         <w:pStyle w:val="Titre2"/>
-      </w:pPr>
-      <w:bookmarkStart w:id="0" w:name="pépi---gestion-de-stock-pépinière"/>
-      <w:bookmarkStart w:id="1" w:name="installation"/>
-      <w:r>
+        <w:rPr>
+          <w:lang w:val="fr-FR"/>
+        </w:rPr>
+      </w:pPr>
+      <w:bookmarkStart w:id="0" w:name="installation"/>
+      <w:bookmarkStart w:id="1" w:name="pépi---gestion-de-stock-pépinière"/>
+      <w:r>
+        <w:rPr>
+          <w:lang w:val="fr-FR"/>
+        </w:rPr>
         <w:t>Installation</w:t>
       </w:r>
     </w:p>
     <w:p>
       <w:pPr>
         <w:pStyle w:val="Titre3"/>
+        <w:rPr>
+          <w:lang w:val="fr-FR"/>
+        </w:rPr>
       </w:pPr>
       <w:bookmarkStart w:id="2" w:name="prérequis"/>
       <w:r>
+        <w:rPr>
+          <w:lang w:val="fr-FR"/>
+        </w:rPr>
         <w:t>Prérequis</w:t>
       </w:r>
     </w:p>
     <w:p>
       <w:pPr>
         <w:pStyle w:val="FirstParagraph"/>
-      </w:pPr>
-      <w:r>
+        <w:rPr>
+          <w:lang w:val="fr-FR"/>
+        </w:rPr>
+      </w:pPr>
+      <w:r>
+        <w:rPr>
+          <w:lang w:val="fr-FR"/>
+        </w:rPr>
         <w:t>Assurez-vous d’avoir installé : - PHP 8.2 ou supérieur - Composer - MySQL 8.0 - Node.js et npm - Symfony CLI (optionnel)</w:t>
       </w:r>
     </w:p>
@@ -58,31 +76,41 @@
     <w:p>
       <w:pPr>
         <w:pStyle w:val="SourceCode"/>
+        <w:rPr>
+          <w:lang w:val="fr-FR"/>
+        </w:rPr>
       </w:pPr>
       <w:r>
         <w:rPr>
           <w:rStyle w:val="FunctionTok"/>
+          <w:lang w:val="fr-FR"/>
         </w:rPr>
         <w:t>git</w:t>
       </w:r>
       <w:r>
         <w:rPr>
           <w:rStyle w:val="NormalTok"/>
+          <w:lang w:val="fr-FR"/>
         </w:rPr>
         <w:t xml:space="preserve"> clone https://github.com/CASTELLS-Cyprien/PEPI-PLUS.git</w:t>
       </w:r>
       <w:r>
+        <w:rPr>
+          <w:lang w:val="fr-FR"/>
+        </w:rPr>
         <w:br/>
       </w:r>
       <w:r>
         <w:rPr>
           <w:rStyle w:val="BuiltInTok"/>
+          <w:lang w:val="fr-FR"/>
         </w:rPr>
         <w:t>cd</w:t>
       </w:r>
       <w:r>
         <w:rPr>
           <w:rStyle w:val="NormalTok"/>
+          <w:lang w:val="fr-FR"/>
         </w:rPr>
         <w:t xml:space="preserve"> PEPI-PLUS</w:t>
       </w:r>
@@ -172,29 +200,53 @@
     <w:p>
       <w:pPr>
         <w:pStyle w:val="FirstParagraph"/>
-      </w:pPr>
-      <w:r>
+        <w:rPr>
+          <w:lang w:val="fr-FR"/>
+        </w:rPr>
+      </w:pPr>
+      <w:r>
+        <w:rPr>
+          <w:lang w:val="fr-FR"/>
+        </w:rPr>
         <w:t xml:space="preserve">Créez un fichier </w:t>
       </w:r>
       <w:r>
         <w:rPr>
           <w:rStyle w:val="VerbatimChar"/>
+          <w:lang w:val="fr-FR"/>
         </w:rPr>
         <w:t>.env.local</w:t>
       </w:r>
       <w:r>
+        <w:rPr>
+          <w:lang w:val="fr-FR"/>
+        </w:rPr>
         <w:t xml:space="preserve"> à la racine du projet :</w:t>
       </w:r>
     </w:p>
     <w:p>
       <w:pPr>
         <w:pStyle w:val="SourceCode"/>
-      </w:pPr>
-      <w:r>
         <w:rPr>
           <w:rStyle w:val="VerbatimChar"/>
-        </w:rPr>
-        <w:t>DATABASE_URL="mysql://root:@127.0.0.1:3306/pepi?charset=utf8mb4"</w:t>
+          <w:lang w:val="fr-FR"/>
+        </w:rPr>
+      </w:pPr>
+      <w:r>
+        <w:rPr>
+          <w:rStyle w:val="VerbatimChar"/>
+          <w:lang w:val="fr-FR"/>
+        </w:rPr>
+        <w:t>DATABASE_URL="mysql://pepi_user:Password123</w:t>
+      </w:r>
+      <w:bookmarkStart w:id="4" w:name="_GoBack"/>
+      <w:bookmarkEnd w:id="4"/>
+      <w:r>
+        <w:rPr>
+          <w:rStyle w:val="VerbatimChar"/>
+          <w:lang w:val="fr-FR"/>
+        </w:rPr>
+        <w:t>@127.0.0.1:3306/pepi?charset=utf8mb4"</w:t>
       </w:r>
     </w:p>
     <w:p>
@@ -204,73 +256,73 @@
           <w:ilvl w:val="0"/>
           <w:numId w:val="16"/>
         </w:numPr>
+        <w:rPr>
+          <w:lang w:val="fr-FR"/>
+        </w:rPr>
       </w:pPr>
       <w:r>
         <w:rPr>
           <w:b/>
           <w:bCs/>
+          <w:lang w:val="fr-FR"/>
         </w:rPr>
         <w:t>Créer et initialiser la base de données</w:t>
       </w:r>
     </w:p>
     <w:p>
       <w:pPr>
+        <w:pStyle w:val="FirstParagraph"/>
+        <w:rPr>
+          <w:lang w:val="fr-FR"/>
+        </w:rPr>
+      </w:pPr>
+      <w:r>
+        <w:rPr>
+          <w:lang w:val="fr-FR"/>
+        </w:rPr>
+        <w:t>Une seule commande suffit pour créer l’utilisateur MySQL, la base de données, exécuter les migrations et charger les données initiales. La commande vous demandera interactivement les identifiants root MySQL :</w:t>
+      </w:r>
+    </w:p>
+    <w:p>
+      <w:pPr>
         <w:pStyle w:val="SourceCode"/>
+        <w:rPr>
+          <w:lang w:val="fr-FR"/>
+        </w:rPr>
       </w:pPr>
       <w:r>
         <w:rPr>
           <w:rStyle w:val="ExtensionTok"/>
+          <w:lang w:val="fr-FR"/>
         </w:rPr>
         <w:t>php</w:t>
       </w:r>
       <w:r>
         <w:rPr>
           <w:rStyle w:val="NormalTok"/>
-        </w:rPr>
-        <w:t xml:space="preserve"> bin/console doctrine:database:create</w:t>
-      </w:r>
-      <w:r>
-        <w:br/>
-      </w:r>
-      <w:r>
-        <w:rPr>
-          <w:rStyle w:val="ExtensionTok"/>
-        </w:rPr>
-        <w:t>php</w:t>
-      </w:r>
-      <w:r>
-        <w:rPr>
-          <w:rStyle w:val="NormalTok"/>
-        </w:rPr>
-        <w:t xml:space="preserve"> bin/console doctrine:migrations:migrate</w:t>
-      </w:r>
-      <w:r>
-        <w:br/>
-      </w:r>
-      <w:r>
-        <w:rPr>
-          <w:rStyle w:val="ExtensionTok"/>
-        </w:rPr>
-        <w:t>php</w:t>
-      </w:r>
-      <w:r>
-        <w:rPr>
-          <w:rStyle w:val="NormalTok"/>
-        </w:rPr>
-        <w:t xml:space="preserve"> bin/console doctrine:fixtures:load</w:t>
+          <w:lang w:val="fr-FR"/>
+        </w:rPr>
+        <w:t xml:space="preserve"> bin/console app:setup-database</w:t>
       </w:r>
     </w:p>
     <w:p>
       <w:pPr>
         <w:pStyle w:val="FirstParagraph"/>
-      </w:pPr>
-      <w:r>
+        <w:rPr>
+          <w:lang w:val="fr-FR"/>
+        </w:rPr>
+      </w:pPr>
+      <w:r>
+        <w:rPr>
+          <w:lang w:val="fr-FR"/>
+        </w:rPr>
         <w:t xml:space="preserve">Si besoin, les exports de la base de données sont stockés dans </w:t>
       </w:r>
       <w:r>
         <w:rPr>
           <w:b/>
           <w:bCs/>
+          <w:lang w:val="fr-FR"/>
         </w:rPr>
         <w:t>/var/backups/db_export_xxxx-xx-xx.sql</w:t>
       </w:r>
@@ -311,8 +363,14 @@
     <w:p>
       <w:pPr>
         <w:pStyle w:val="FirstParagraph"/>
-      </w:pPr>
-      <w:r>
+        <w:rPr>
+          <w:lang w:val="fr-FR"/>
+        </w:rPr>
+      </w:pPr>
+      <w:r>
+        <w:rPr>
+          <w:lang w:val="fr-FR"/>
+        </w:rPr>
         <w:t>Pour le développement avec rechargement automatique :</w:t>
       </w:r>
     </w:p>
@@ -369,41 +427,61 @@
     <w:p>
       <w:pPr>
         <w:pStyle w:val="FirstParagraph"/>
-      </w:pPr>
-      <w:r>
+        <w:rPr>
+          <w:lang w:val="fr-FR"/>
+        </w:rPr>
+      </w:pPr>
+      <w:r>
+        <w:rPr>
+          <w:lang w:val="fr-FR"/>
+        </w:rPr>
         <w:t xml:space="preserve">L’application est maintenant accessible sur </w:t>
       </w:r>
       <w:r>
         <w:rPr>
           <w:b/>
           <w:bCs/>
+          <w:lang w:val="fr-FR"/>
         </w:rPr>
         <w:t>http://localhost:8000</w:t>
       </w:r>
     </w:p>
     <w:p>
       <w:r>
+        <w:lastRenderedPageBreak/>
         <w:pict w14:anchorId="23681155">
-          <v:rect id="_x0000_i1030" style="width:0;height:1.5pt" o:hralign="center" o:hrstd="t" o:hr="t"/>
+          <v:rect id="_x0000_i1025" style="width:0;height:1.5pt" o:hralign="center" o:hrstd="t" o:hr="t"/>
         </w:pict>
       </w:r>
     </w:p>
     <w:p>
       <w:pPr>
         <w:pStyle w:val="Titre2"/>
-      </w:pPr>
-      <w:bookmarkStart w:id="4" w:name="comptes-de-test"/>
-      <w:bookmarkEnd w:id="1"/>
+        <w:rPr>
+          <w:lang w:val="fr-FR"/>
+        </w:rPr>
+      </w:pPr>
+      <w:bookmarkStart w:id="5" w:name="comptes-de-test"/>
+      <w:bookmarkEnd w:id="0"/>
       <w:bookmarkEnd w:id="3"/>
       <w:r>
+        <w:rPr>
+          <w:lang w:val="fr-FR"/>
+        </w:rPr>
         <w:t>Comptes de test</w:t>
       </w:r>
     </w:p>
     <w:p>
       <w:pPr>
         <w:pStyle w:val="FirstParagraph"/>
-      </w:pPr>
-      <w:r>
+        <w:rPr>
+          <w:lang w:val="fr-FR"/>
+        </w:rPr>
+      </w:pPr>
+      <w:r>
+        <w:rPr>
+          <w:lang w:val="fr-FR"/>
+        </w:rPr>
         <w:t>Pour tester l’application, utilisez les identifiants suivants :</w:t>
       </w:r>
     </w:p>
@@ -432,7 +510,6 @@
               <w:pStyle w:val="Compact"/>
             </w:pPr>
             <w:r>
-              <w:lastRenderedPageBreak/>
               <w:t>Rôle</w:t>
             </w:r>
           </w:p>
@@ -612,43 +689,65 @@
     <w:p>
       <w:r>
         <w:pict w14:anchorId="6A6DAE06">
-          <v:rect id="_x0000_i1031" style="width:0;height:1.5pt" o:hralign="center" o:hrstd="t" o:hr="t"/>
+          <v:rect id="_x0000_i1026" style="width:0;height:1.5pt" o:hralign="center" o:hrstd="t" o:hr="t"/>
         </w:pict>
       </w:r>
     </w:p>
     <w:p>
       <w:pPr>
         <w:pStyle w:val="Titre2"/>
-      </w:pPr>
-      <w:bookmarkStart w:id="5" w:name="documentation"/>
-      <w:bookmarkEnd w:id="4"/>
-      <w:r>
+        <w:rPr>
+          <w:lang w:val="fr-FR"/>
+        </w:rPr>
+      </w:pPr>
+      <w:bookmarkStart w:id="6" w:name="documentation"/>
+      <w:bookmarkEnd w:id="5"/>
+      <w:r>
+        <w:rPr>
+          <w:lang w:val="fr-FR"/>
+        </w:rPr>
         <w:t>Documentation</w:t>
       </w:r>
     </w:p>
     <w:p>
       <w:pPr>
         <w:pStyle w:val="Titre3"/>
-      </w:pPr>
-      <w:bookmarkStart w:id="6" w:name="documents-disponibles"/>
-      <w:r>
+        <w:rPr>
+          <w:lang w:val="fr-FR"/>
+        </w:rPr>
+      </w:pPr>
+      <w:bookmarkStart w:id="7" w:name="documents-disponibles"/>
+      <w:r>
+        <w:rPr>
+          <w:lang w:val="fr-FR"/>
+        </w:rPr>
         <w:t>Documents disponibles</w:t>
       </w:r>
     </w:p>
     <w:p>
       <w:pPr>
         <w:pStyle w:val="FirstParagraph"/>
-      </w:pPr>
-      <w:r>
+        <w:rPr>
+          <w:lang w:val="fr-FR"/>
+        </w:rPr>
+      </w:pPr>
+      <w:r>
+        <w:rPr>
+          <w:lang w:val="fr-FR"/>
+        </w:rPr>
         <w:t xml:space="preserve">Tous les documents sont disponibles dans le dossier </w:t>
       </w:r>
       <w:r>
         <w:rPr>
           <w:rStyle w:val="VerbatimChar"/>
+          <w:lang w:val="fr-FR"/>
         </w:rPr>
         <w:t>assets/</w:t>
       </w:r>
       <w:r>
+        <w:rPr>
+          <w:lang w:val="fr-FR"/>
+        </w:rPr>
         <w:t xml:space="preserve"> :</w:t>
       </w:r>
     </w:p>
@@ -659,20 +758,28 @@
           <w:ilvl w:val="0"/>
           <w:numId w:val="19"/>
         </w:numPr>
+        <w:rPr>
+          <w:lang w:val="fr-FR"/>
+        </w:rPr>
       </w:pPr>
       <w:r>
         <w:rPr>
           <w:b/>
           <w:bCs/>
+          <w:lang w:val="fr-FR"/>
         </w:rPr>
         <w:t>Cahier des charges</w:t>
       </w:r>
       <w:r>
+        <w:rPr>
+          <w:lang w:val="fr-FR"/>
+        </w:rPr>
         <w:t xml:space="preserve"> : </w:t>
       </w:r>
       <w:r>
         <w:rPr>
           <w:rStyle w:val="VerbatimChar"/>
+          <w:lang w:val="fr-FR"/>
         </w:rPr>
         <w:t>assets/document/CdC_PepiPlus.pdf</w:t>
       </w:r>
@@ -684,20 +791,28 @@
           <w:ilvl w:val="0"/>
           <w:numId w:val="19"/>
         </w:numPr>
+        <w:rPr>
+          <w:lang w:val="fr-FR"/>
+        </w:rPr>
       </w:pPr>
       <w:r>
         <w:rPr>
           <w:b/>
           <w:bCs/>
+          <w:lang w:val="fr-FR"/>
         </w:rPr>
         <w:t>MCD</w:t>
       </w:r>
       <w:r>
+        <w:rPr>
+          <w:lang w:val="fr-FR"/>
+        </w:rPr>
         <w:t xml:space="preserve"> (Schéma conceptuel) : </w:t>
       </w:r>
       <w:r>
         <w:rPr>
           <w:rStyle w:val="VerbatimChar"/>
+          <w:lang w:val="fr-FR"/>
         </w:rPr>
         <w:t>assets/schema/MCD.pdf</w:t>
       </w:r>
@@ -709,20 +824,28 @@
           <w:ilvl w:val="0"/>
           <w:numId w:val="19"/>
         </w:numPr>
+        <w:rPr>
+          <w:lang w:val="fr-FR"/>
+        </w:rPr>
       </w:pPr>
       <w:r>
         <w:rPr>
           <w:b/>
           <w:bCs/>
+          <w:lang w:val="fr-FR"/>
         </w:rPr>
         <w:t>MLD</w:t>
       </w:r>
       <w:r>
+        <w:rPr>
+          <w:lang w:val="fr-FR"/>
+        </w:rPr>
         <w:t xml:space="preserve"> (Schéma logique) : </w:t>
       </w:r>
       <w:r>
         <w:rPr>
           <w:rStyle w:val="VerbatimChar"/>
+          <w:lang w:val="fr-FR"/>
         </w:rPr>
         <w:t>assets/schema/MLD.pdf</w:t>
       </w:r>
@@ -730,283 +853,378 @@
     <w:p>
       <w:r>
         <w:pict w14:anchorId="0CBA10F5">
-          <v:rect id="_x0000_i1032" style="width:0;height:1.5pt" o:hralign="center" o:hrstd="t" o:hr="t"/>
+          <v:rect id="_x0000_i1027" style="width:0;height:1.5pt" o:hralign="center" o:hrstd="t" o:hr="t"/>
         </w:pict>
       </w:r>
     </w:p>
     <w:p>
       <w:pPr>
         <w:pStyle w:val="Titre4"/>
-      </w:pPr>
-      <w:bookmarkStart w:id="7" w:name="structure-des-commentaires"/>
-      <w:r>
+        <w:rPr>
+          <w:lang w:val="fr-FR"/>
+        </w:rPr>
+      </w:pPr>
+      <w:bookmarkStart w:id="8" w:name="structure-des-commentaires"/>
+      <w:r>
+        <w:rPr>
+          <w:lang w:val="fr-FR"/>
+        </w:rPr>
         <w:t>Structure des commentaires</w:t>
       </w:r>
     </w:p>
     <w:p>
       <w:pPr>
         <w:pStyle w:val="FirstParagraph"/>
-      </w:pPr>
-      <w:r>
+        <w:rPr>
+          <w:lang w:val="fr-FR"/>
+        </w:rPr>
+      </w:pPr>
+      <w:r>
+        <w:rPr>
+          <w:lang w:val="fr-FR"/>
+        </w:rPr>
         <w:t>Chaque classe, méthode et propriété suit le format suivant :</w:t>
       </w:r>
     </w:p>
     <w:p>
       <w:pPr>
         <w:pStyle w:val="SourceCode"/>
+        <w:rPr>
+          <w:lang w:val="fr-FR"/>
+        </w:rPr>
       </w:pPr>
       <w:r>
         <w:rPr>
           <w:rStyle w:val="CommentTok"/>
+          <w:lang w:val="fr-FR"/>
         </w:rPr>
         <w:t>/**</w:t>
       </w:r>
       <w:r>
+        <w:rPr>
+          <w:lang w:val="fr-FR"/>
+        </w:rPr>
         <w:br/>
       </w:r>
       <w:r>
         <w:rPr>
           <w:rStyle w:val="CommentTok"/>
+          <w:lang w:val="fr-FR"/>
         </w:rPr>
         <w:t xml:space="preserve"> * Description courte de la classe ou méthode.</w:t>
       </w:r>
       <w:r>
+        <w:rPr>
+          <w:lang w:val="fr-FR"/>
+        </w:rPr>
         <w:br/>
       </w:r>
       <w:r>
         <w:rPr>
           <w:rStyle w:val="CommentTok"/>
+          <w:lang w:val="fr-FR"/>
         </w:rPr>
         <w:t xml:space="preserve"> *</w:t>
       </w:r>
       <w:r>
+        <w:rPr>
+          <w:lang w:val="fr-FR"/>
+        </w:rPr>
         <w:br/>
       </w:r>
       <w:r>
         <w:rPr>
           <w:rStyle w:val="CommentTok"/>
+          <w:lang w:val="fr-FR"/>
         </w:rPr>
         <w:t xml:space="preserve"> * Description longue optionnelle expliquant le comportement,</w:t>
       </w:r>
       <w:r>
+        <w:rPr>
+          <w:lang w:val="fr-FR"/>
+        </w:rPr>
         <w:br/>
       </w:r>
       <w:r>
         <w:rPr>
           <w:rStyle w:val="CommentTok"/>
+          <w:lang w:val="fr-FR"/>
         </w:rPr>
         <w:t xml:space="preserve"> * les règles métier associées et les cas particuliers.</w:t>
       </w:r>
       <w:r>
+        <w:rPr>
+          <w:lang w:val="fr-FR"/>
+        </w:rPr>
         <w:br/>
       </w:r>
       <w:r>
         <w:rPr>
           <w:rStyle w:val="CommentTok"/>
+          <w:lang w:val="fr-FR"/>
         </w:rPr>
         <w:t xml:space="preserve"> *</w:t>
       </w:r>
       <w:r>
+        <w:rPr>
+          <w:lang w:val="fr-FR"/>
+        </w:rPr>
         <w:br/>
       </w:r>
       <w:r>
         <w:rPr>
           <w:rStyle w:val="CommentTok"/>
+          <w:lang w:val="fr-FR"/>
         </w:rPr>
         <w:t xml:space="preserve"> * </w:t>
       </w:r>
       <w:r>
         <w:rPr>
           <w:rStyle w:val="AnnotationTok"/>
+          <w:lang w:val="fr-FR"/>
         </w:rPr>
         <w:t>@param</w:t>
       </w:r>
       <w:r>
         <w:rPr>
           <w:rStyle w:val="CommentTok"/>
+          <w:lang w:val="fr-FR"/>
         </w:rPr>
         <w:t xml:space="preserve"> </w:t>
       </w:r>
       <w:r>
         <w:rPr>
           <w:rStyle w:val="CommentVarTok"/>
+          <w:lang w:val="fr-FR"/>
         </w:rPr>
         <w:t>Type</w:t>
       </w:r>
       <w:r>
         <w:rPr>
           <w:rStyle w:val="CommentTok"/>
+          <w:lang w:val="fr-FR"/>
         </w:rPr>
         <w:t xml:space="preserve">  $parametre  Description du paramètre.</w:t>
       </w:r>
       <w:r>
+        <w:rPr>
+          <w:lang w:val="fr-FR"/>
+        </w:rPr>
         <w:br/>
       </w:r>
       <w:r>
         <w:rPr>
           <w:rStyle w:val="CommentTok"/>
+          <w:lang w:val="fr-FR"/>
         </w:rPr>
         <w:t xml:space="preserve"> * </w:t>
       </w:r>
       <w:r>
         <w:rPr>
           <w:rStyle w:val="AnnotationTok"/>
+          <w:lang w:val="fr-FR"/>
         </w:rPr>
         <w:t>@param</w:t>
       </w:r>
       <w:r>
         <w:rPr>
           <w:rStyle w:val="CommentTok"/>
+          <w:lang w:val="fr-FR"/>
         </w:rPr>
         <w:t xml:space="preserve"> </w:t>
       </w:r>
       <w:r>
         <w:rPr>
           <w:rStyle w:val="CommentVarTok"/>
+          <w:lang w:val="fr-FR"/>
         </w:rPr>
         <w:t>Type</w:t>
       </w:r>
       <w:r>
         <w:rPr>
           <w:rStyle w:val="CommentTok"/>
+          <w:lang w:val="fr-FR"/>
         </w:rPr>
         <w:t xml:space="preserve">  $autre      Description du second paramètre.</w:t>
       </w:r>
       <w:r>
+        <w:rPr>
+          <w:lang w:val="fr-FR"/>
+        </w:rPr>
         <w:br/>
       </w:r>
       <w:r>
         <w:rPr>
           <w:rStyle w:val="CommentTok"/>
+          <w:lang w:val="fr-FR"/>
         </w:rPr>
         <w:t xml:space="preserve"> *</w:t>
       </w:r>
       <w:r>
+        <w:rPr>
+          <w:lang w:val="fr-FR"/>
+        </w:rPr>
         <w:br/>
       </w:r>
       <w:r>
         <w:rPr>
           <w:rStyle w:val="CommentTok"/>
+          <w:lang w:val="fr-FR"/>
         </w:rPr>
         <w:t xml:space="preserve"> * </w:t>
       </w:r>
       <w:r>
         <w:rPr>
           <w:rStyle w:val="AnnotationTok"/>
+          <w:lang w:val="fr-FR"/>
         </w:rPr>
         <w:t>@return</w:t>
       </w:r>
       <w:r>
         <w:rPr>
           <w:rStyle w:val="CommentTok"/>
+          <w:lang w:val="fr-FR"/>
         </w:rPr>
         <w:t xml:space="preserve"> Type Description de la valeur retournée.</w:t>
       </w:r>
       <w:r>
+        <w:rPr>
+          <w:lang w:val="fr-FR"/>
+        </w:rPr>
         <w:br/>
       </w:r>
       <w:r>
         <w:rPr>
           <w:rStyle w:val="CommentTok"/>
+          <w:lang w:val="fr-FR"/>
         </w:rPr>
         <w:t xml:space="preserve"> *</w:t>
       </w:r>
       <w:r>
+        <w:rPr>
+          <w:lang w:val="fr-FR"/>
+        </w:rPr>
         <w:br/>
       </w:r>
       <w:r>
         <w:rPr>
           <w:rStyle w:val="CommentTok"/>
+          <w:lang w:val="fr-FR"/>
         </w:rPr>
         <w:t xml:space="preserve"> * </w:t>
       </w:r>
       <w:r>
         <w:rPr>
           <w:rStyle w:val="AnnotationTok"/>
+          <w:lang w:val="fr-FR"/>
         </w:rPr>
         <w:t>@throws</w:t>
       </w:r>
       <w:r>
         <w:rPr>
           <w:rStyle w:val="CommentTok"/>
+          <w:lang w:val="fr-FR"/>
         </w:rPr>
         <w:t xml:space="preserve"> </w:t>
       </w:r>
       <w:r>
         <w:rPr>
           <w:rStyle w:val="CommentVarTok"/>
+          <w:lang w:val="fr-FR"/>
         </w:rPr>
         <w:t>ExceptionType</w:t>
       </w:r>
       <w:r>
         <w:rPr>
           <w:rStyle w:val="CommentTok"/>
+          <w:lang w:val="fr-FR"/>
         </w:rPr>
         <w:t xml:space="preserve"> Dans quel cas l'exception est levée.</w:t>
       </w:r>
       <w:r>
+        <w:rPr>
+          <w:lang w:val="fr-FR"/>
+        </w:rPr>
         <w:br/>
       </w:r>
       <w:r>
         <w:rPr>
           <w:rStyle w:val="CommentTok"/>
+          <w:lang w:val="fr-FR"/>
         </w:rPr>
         <w:t xml:space="preserve"> *</w:t>
       </w:r>
       <w:r>
+        <w:rPr>
+          <w:lang w:val="fr-FR"/>
+        </w:rPr>
         <w:br/>
       </w:r>
       <w:r>
         <w:rPr>
           <w:rStyle w:val="CommentTok"/>
+          <w:lang w:val="fr-FR"/>
         </w:rPr>
         <w:t xml:space="preserve"> * </w:t>
       </w:r>
       <w:r>
         <w:rPr>
           <w:rStyle w:val="AnnotationTok"/>
+          <w:lang w:val="fr-FR"/>
         </w:rPr>
         <w:t>@author</w:t>
       </w:r>
       <w:r>
         <w:rPr>
           <w:rStyle w:val="CommentTok"/>
+          <w:lang w:val="fr-FR"/>
         </w:rPr>
         <w:t xml:space="preserve"> CASTELLS Cyprien</w:t>
       </w:r>
       <w:r>
+        <w:rPr>
+          <w:lang w:val="fr-FR"/>
+        </w:rPr>
         <w:br/>
       </w:r>
       <w:r>
         <w:rPr>
           <w:rStyle w:val="CommentTok"/>
+          <w:lang w:val="fr-FR"/>
         </w:rPr>
         <w:t xml:space="preserve"> * </w:t>
       </w:r>
       <w:r>
         <w:rPr>
           <w:rStyle w:val="AnnotationTok"/>
+          <w:lang w:val="fr-FR"/>
         </w:rPr>
         <w:t>@version</w:t>
       </w:r>
       <w:r>
         <w:rPr>
           <w:rStyle w:val="CommentTok"/>
+          <w:lang w:val="fr-FR"/>
         </w:rPr>
         <w:t xml:space="preserve"> </w:t>
       </w:r>
       <w:r>
         <w:rPr>
           <w:rStyle w:val="CommentVarTok"/>
+          <w:lang w:val="fr-FR"/>
         </w:rPr>
         <w:t>1.2</w:t>
       </w:r>
       <w:r>
+        <w:rPr>
+          <w:lang w:val="fr-FR"/>
+        </w:rPr>
         <w:br/>
       </w:r>
       <w:r>
         <w:rPr>
           <w:rStyle w:val="CommentTok"/>
+          <w:lang w:val="fr-FR"/>
         </w:rPr>
         <w:t xml:space="preserve"> */</w:t>
       </w:r>
@@ -1014,28 +1232,44 @@
     <w:p>
       <w:pPr>
         <w:pStyle w:val="Titre4"/>
-      </w:pPr>
-      <w:bookmarkStart w:id="8" w:name="générer-la-documentation-html"/>
-      <w:bookmarkEnd w:id="7"/>
-      <w:r>
+        <w:rPr>
+          <w:lang w:val="fr-FR"/>
+        </w:rPr>
+      </w:pPr>
+      <w:bookmarkStart w:id="9" w:name="générer-la-documentation-html"/>
+      <w:bookmarkEnd w:id="8"/>
+      <w:r>
+        <w:rPr>
+          <w:lang w:val="fr-FR"/>
+        </w:rPr>
         <w:t>Générer la documentation HTML</w:t>
       </w:r>
     </w:p>
     <w:p>
       <w:pPr>
         <w:pStyle w:val="FirstParagraph"/>
-      </w:pPr>
-      <w:r>
+        <w:rPr>
+          <w:lang w:val="fr-FR"/>
+        </w:rPr>
+      </w:pPr>
+      <w:r>
+        <w:rPr>
+          <w:lang w:val="fr-FR"/>
+        </w:rPr>
         <w:t xml:space="preserve">La documentation peut être générée localement avec </w:t>
       </w:r>
       <w:r>
         <w:rPr>
           <w:b/>
           <w:bCs/>
+          <w:lang w:val="fr-FR"/>
         </w:rPr>
         <w:t>PHPDocumentor</w:t>
       </w:r>
       <w:r>
+        <w:rPr>
+          <w:lang w:val="fr-FR"/>
+        </w:rPr>
         <w:t xml:space="preserve"> :</w:t>
       </w:r>
     </w:p>
@@ -1063,58 +1297,71 @@
     <w:p>
       <w:pPr>
         <w:pStyle w:val="SourceCode"/>
+        <w:rPr>
+          <w:lang w:val="fr-FR"/>
+        </w:rPr>
       </w:pPr>
       <w:r>
         <w:rPr>
           <w:rStyle w:val="FunctionTok"/>
-        </w:rPr>
+          <w:lang w:val="fr-FR"/>
+        </w:rPr>
+        <w:lastRenderedPageBreak/>
         <w:t>Invoke-WebRequest</w:t>
       </w:r>
       <w:r>
         <w:rPr>
           <w:rStyle w:val="NormalTok"/>
+          <w:lang w:val="fr-FR"/>
         </w:rPr>
         <w:t xml:space="preserve"> </w:t>
       </w:r>
       <w:r>
         <w:rPr>
           <w:rStyle w:val="OperatorTok"/>
+          <w:lang w:val="fr-FR"/>
         </w:rPr>
         <w:t>-</w:t>
       </w:r>
       <w:r>
         <w:rPr>
           <w:rStyle w:val="NormalTok"/>
+          <w:lang w:val="fr-FR"/>
         </w:rPr>
         <w:t xml:space="preserve">Uri </w:t>
       </w:r>
       <w:r>
         <w:rPr>
           <w:rStyle w:val="StringTok"/>
+          <w:lang w:val="fr-FR"/>
         </w:rPr>
         <w:t>"https://github.com/phpDocumentor/phpDocumentor/releases/download/v3.9.1/phpDocumentor.phar"</w:t>
       </w:r>
       <w:r>
         <w:rPr>
           <w:rStyle w:val="NormalTok"/>
+          <w:lang w:val="fr-FR"/>
         </w:rPr>
         <w:t xml:space="preserve"> </w:t>
       </w:r>
       <w:r>
         <w:rPr>
           <w:rStyle w:val="OperatorTok"/>
+          <w:lang w:val="fr-FR"/>
         </w:rPr>
         <w:t>-</w:t>
       </w:r>
       <w:r>
         <w:rPr>
           <w:rStyle w:val="NormalTok"/>
+          <w:lang w:val="fr-FR"/>
         </w:rPr>
         <w:t xml:space="preserve">OutFile </w:t>
       </w:r>
       <w:r>
         <w:rPr>
           <w:rStyle w:val="StringTok"/>
+          <w:lang w:val="fr-FR"/>
         </w:rPr>
         <w:t>"phpDocumentor.phar"</w:t>
       </w:r>
@@ -1134,40 +1381,49 @@
     <w:p>
       <w:pPr>
         <w:pStyle w:val="SourceCode"/>
+        <w:rPr>
+          <w:lang w:val="fr-FR"/>
+        </w:rPr>
       </w:pPr>
       <w:r>
         <w:rPr>
           <w:rStyle w:val="ExtensionTok"/>
+          <w:lang w:val="fr-FR"/>
         </w:rPr>
         <w:t>php</w:t>
       </w:r>
       <w:r>
         <w:rPr>
           <w:rStyle w:val="NormalTok"/>
+          <w:lang w:val="fr-FR"/>
         </w:rPr>
         <w:t xml:space="preserve"> phpDocumentor.phar </w:t>
       </w:r>
       <w:r>
         <w:rPr>
           <w:rStyle w:val="AttributeTok"/>
+          <w:lang w:val="fr-FR"/>
         </w:rPr>
         <w:t>-d</w:t>
       </w:r>
       <w:r>
         <w:rPr>
           <w:rStyle w:val="NormalTok"/>
+          <w:lang w:val="fr-FR"/>
         </w:rPr>
         <w:t xml:space="preserve"> src/ </w:t>
       </w:r>
       <w:r>
         <w:rPr>
           <w:rStyle w:val="AttributeTok"/>
+          <w:lang w:val="fr-FR"/>
         </w:rPr>
         <w:t>-t</w:t>
       </w:r>
       <w:r>
         <w:rPr>
           <w:rStyle w:val="NormalTok"/>
+          <w:lang w:val="fr-FR"/>
         </w:rPr>
         <w:t xml:space="preserve"> var/api-docs</w:t>
       </w:r>
@@ -1181,7 +1437,6 @@
         </w:numPr>
       </w:pPr>
       <w:r>
-        <w:lastRenderedPageBreak/>
         <w:t>Accès :</w:t>
       </w:r>
     </w:p>
@@ -1200,23 +1455,13 @@
       <w:pPr>
         <w:pStyle w:val="Titre2"/>
       </w:pPr>
-      <w:bookmarkStart w:id="9" w:name="commandes-utiles"/>
-      <w:bookmarkEnd w:id="5"/>
+      <w:bookmarkStart w:id="10" w:name="commandes-utiles"/>
       <w:bookmarkEnd w:id="6"/>
-      <w:bookmarkEnd w:id="8"/>
-      <w:proofErr w:type="spellStart"/>
-      <w:r>
-        <w:t>Commandes</w:t>
-      </w:r>
-      <w:proofErr w:type="spellEnd"/>
-      <w:r>
-        <w:t xml:space="preserve"> </w:t>
-      </w:r>
-      <w:proofErr w:type="spellStart"/>
-      <w:r>
-        <w:t>utiles</w:t>
-      </w:r>
-      <w:proofErr w:type="spellEnd"/>
+      <w:bookmarkEnd w:id="7"/>
+      <w:bookmarkEnd w:id="9"/>
+      <w:r>
+        <w:t>Commandes utiles</w:t>
+      </w:r>
     </w:p>
     <w:p>
       <w:pPr>
@@ -1226,224 +1471,314 @@
     <w:p>
       <w:pPr>
         <w:pStyle w:val="SourceCode"/>
+        <w:rPr>
+          <w:lang w:val="fr-FR"/>
+        </w:rPr>
       </w:pPr>
       <w:r>
         <w:rPr>
           <w:rStyle w:val="CommentTok"/>
+          <w:lang w:val="fr-FR"/>
+        </w:rPr>
+        <w:t># Initialiser complètement la base de données (création user MySQL + BDD + migrations + fixtures)</w:t>
+      </w:r>
+      <w:r>
+        <w:rPr>
+          <w:lang w:val="fr-FR"/>
+        </w:rPr>
+        <w:br/>
+      </w:r>
+      <w:r>
+        <w:rPr>
+          <w:rStyle w:val="ExtensionTok"/>
+          <w:lang w:val="fr-FR"/>
+        </w:rPr>
+        <w:t>php</w:t>
+      </w:r>
+      <w:r>
+        <w:rPr>
+          <w:rStyle w:val="NormalTok"/>
+          <w:lang w:val="fr-FR"/>
+        </w:rPr>
+        <w:t xml:space="preserve"> bin/console app:setup-database</w:t>
+      </w:r>
+      <w:r>
+        <w:rPr>
+          <w:lang w:val="fr-FR"/>
+        </w:rPr>
+        <w:br/>
+        <w:br/>
+      </w:r>
+      <w:r>
+        <w:rPr>
+          <w:rStyle w:val="CommentTok"/>
+          <w:lang w:val="fr-FR"/>
         </w:rPr>
         <w:t># Créer une nouvelle migration</w:t>
       </w:r>
       <w:r>
+        <w:rPr>
+          <w:lang w:val="fr-FR"/>
+        </w:rPr>
         <w:br/>
       </w:r>
       <w:r>
         <w:rPr>
           <w:rStyle w:val="ExtensionTok"/>
+          <w:lang w:val="fr-FR"/>
         </w:rPr>
         <w:t>php</w:t>
       </w:r>
       <w:r>
         <w:rPr>
           <w:rStyle w:val="NormalTok"/>
+          <w:lang w:val="fr-FR"/>
         </w:rPr>
         <w:t xml:space="preserve"> bin/console make:migration</w:t>
       </w:r>
       <w:r>
+        <w:rPr>
+          <w:lang w:val="fr-FR"/>
+        </w:rPr>
         <w:br/>
-      </w:r>
-      <w:r>
         <w:br/>
       </w:r>
       <w:r>
         <w:rPr>
           <w:rStyle w:val="CommentTok"/>
+          <w:lang w:val="fr-FR"/>
         </w:rPr>
         <w:t># Exécuter les migrations</w:t>
       </w:r>
       <w:r>
+        <w:rPr>
+          <w:lang w:val="fr-FR"/>
+        </w:rPr>
         <w:br/>
       </w:r>
       <w:r>
         <w:rPr>
           <w:rStyle w:val="ExtensionTok"/>
+          <w:lang w:val="fr-FR"/>
         </w:rPr>
         <w:t>php</w:t>
       </w:r>
       <w:r>
         <w:rPr>
           <w:rStyle w:val="NormalTok"/>
+          <w:lang w:val="fr-FR"/>
         </w:rPr>
         <w:t xml:space="preserve"> bin/console doctrine:migrations:migrate</w:t>
       </w:r>
       <w:r>
+        <w:rPr>
+          <w:lang w:val="fr-FR"/>
+        </w:rPr>
         <w:br/>
-      </w:r>
-      <w:r>
         <w:br/>
       </w:r>
       <w:r>
         <w:rPr>
           <w:rStyle w:val="CommentTok"/>
+          <w:lang w:val="fr-FR"/>
         </w:rPr>
         <w:t># Charger les fixtures (données de test)</w:t>
       </w:r>
       <w:r>
+        <w:rPr>
+          <w:lang w:val="fr-FR"/>
+        </w:rPr>
         <w:br/>
       </w:r>
       <w:r>
         <w:rPr>
           <w:rStyle w:val="ExtensionTok"/>
+          <w:lang w:val="fr-FR"/>
         </w:rPr>
         <w:t>php</w:t>
       </w:r>
       <w:r>
         <w:rPr>
           <w:rStyle w:val="NormalTok"/>
+          <w:lang w:val="fr-FR"/>
         </w:rPr>
         <w:t xml:space="preserve"> bin/console doctrine:fixtures:load</w:t>
       </w:r>
       <w:r>
+        <w:rPr>
+          <w:lang w:val="fr-FR"/>
+        </w:rPr>
         <w:br/>
-      </w:r>
-      <w:r>
         <w:br/>
       </w:r>
       <w:r>
         <w:rPr>
           <w:rStyle w:val="CommentTok"/>
+          <w:lang w:val="fr-FR"/>
         </w:rPr>
         <w:t># Vider le cache</w:t>
       </w:r>
       <w:r>
+        <w:rPr>
+          <w:lang w:val="fr-FR"/>
+        </w:rPr>
         <w:br/>
       </w:r>
       <w:r>
         <w:rPr>
           <w:rStyle w:val="ExtensionTok"/>
+          <w:lang w:val="fr-FR"/>
         </w:rPr>
         <w:t>php</w:t>
       </w:r>
       <w:r>
         <w:rPr>
           <w:rStyle w:val="NormalTok"/>
+          <w:lang w:val="fr-FR"/>
         </w:rPr>
         <w:t xml:space="preserve"> bin/console cache:clear</w:t>
       </w:r>
       <w:r>
+        <w:rPr>
+          <w:lang w:val="fr-FR"/>
+        </w:rPr>
         <w:br/>
-      </w:r>
-      <w:r>
         <w:br/>
       </w:r>
       <w:r>
         <w:rPr>
           <w:rStyle w:val="CommentTok"/>
+          <w:lang w:val="fr-FR"/>
         </w:rPr>
         <w:t># Supprimer la base de données</w:t>
       </w:r>
       <w:r>
+        <w:rPr>
+          <w:lang w:val="fr-FR"/>
+        </w:rPr>
         <w:br/>
       </w:r>
       <w:r>
         <w:rPr>
           <w:rStyle w:val="ExtensionTok"/>
+          <w:lang w:val="fr-FR"/>
         </w:rPr>
         <w:t>php</w:t>
       </w:r>
       <w:r>
         <w:rPr>
           <w:rStyle w:val="NormalTok"/>
+          <w:lang w:val="fr-FR"/>
         </w:rPr>
         <w:t xml:space="preserve"> bin/console doctrine:database:drop </w:t>
       </w:r>
       <w:r>
         <w:rPr>
           <w:rStyle w:val="AttributeTok"/>
+          <w:lang w:val="fr-FR"/>
         </w:rPr>
         <w:t>--force</w:t>
       </w:r>
       <w:r>
+        <w:rPr>
+          <w:lang w:val="fr-FR"/>
+        </w:rPr>
         <w:br/>
-      </w:r>
-      <w:r>
         <w:br/>
       </w:r>
       <w:r>
         <w:rPr>
           <w:rStyle w:val="CommentTok"/>
+          <w:lang w:val="fr-FR"/>
         </w:rPr>
         <w:t># Générer la documentation PHPDoc</w:t>
       </w:r>
       <w:r>
+        <w:rPr>
+          <w:lang w:val="fr-FR"/>
+        </w:rPr>
         <w:br/>
       </w:r>
       <w:r>
         <w:rPr>
           <w:rStyle w:val="ExtensionTok"/>
+          <w:lang w:val="fr-FR"/>
         </w:rPr>
         <w:t>php</w:t>
       </w:r>
       <w:r>
         <w:rPr>
           <w:rStyle w:val="NormalTok"/>
+          <w:lang w:val="fr-FR"/>
         </w:rPr>
         <w:t xml:space="preserve"> phpDocumentor.phar </w:t>
       </w:r>
       <w:r>
         <w:rPr>
           <w:rStyle w:val="AttributeTok"/>
+          <w:lang w:val="fr-FR"/>
         </w:rPr>
         <w:t>-d</w:t>
       </w:r>
       <w:r>
         <w:rPr>
           <w:rStyle w:val="NormalTok"/>
+          <w:lang w:val="fr-FR"/>
         </w:rPr>
         <w:t xml:space="preserve"> src/ </w:t>
       </w:r>
       <w:r>
         <w:rPr>
           <w:rStyle w:val="AttributeTok"/>
+          <w:lang w:val="fr-FR"/>
         </w:rPr>
         <w:t>-t</w:t>
       </w:r>
       <w:r>
         <w:rPr>
           <w:rStyle w:val="NormalTok"/>
+          <w:lang w:val="fr-FR"/>
         </w:rPr>
         <w:t xml:space="preserve"> var/api-docs</w:t>
       </w:r>
       <w:r>
+        <w:rPr>
+          <w:lang w:val="fr-FR"/>
+        </w:rPr>
         <w:br/>
-      </w:r>
-      <w:r>
         <w:br/>
       </w:r>
       <w:r>
         <w:rPr>
           <w:rStyle w:val="CommentTok"/>
+          <w:lang w:val="fr-FR"/>
         </w:rPr>
         <w:t># Corriger le style du code (normes Symfony)</w:t>
       </w:r>
       <w:r>
+        <w:rPr>
+          <w:lang w:val="fr-FR"/>
+        </w:rPr>
         <w:br/>
       </w:r>
       <w:r>
         <w:rPr>
           <w:rStyle w:val="ExtensionTok"/>
+          <w:lang w:val="fr-FR"/>
         </w:rPr>
         <w:t>vendor/bin/php-cs-fixer</w:t>
       </w:r>
       <w:r>
         <w:rPr>
           <w:rStyle w:val="NormalTok"/>
+          <w:lang w:val="fr-FR"/>
         </w:rPr>
         <w:t xml:space="preserve"> fix src/</w:t>
       </w:r>
-      <w:bookmarkStart w:id="10" w:name="contact"/>
-      <w:bookmarkEnd w:id="0"/>
-      <w:bookmarkEnd w:id="9"/>
+      <w:bookmarkStart w:id="11" w:name="contact"/>
+      <w:bookmarkEnd w:id="1"/>
       <w:bookmarkEnd w:id="10"/>
+      <w:bookmarkEnd w:id="11"/>
     </w:p>
     <w:sectPr>
       <w:pgSz w:w="12240" w:h="15840"/>
@@ -1455,7 +1790,7 @@
 </file>
 
 <file path=word/endnotes.xml><?xml version="1.0" encoding="utf-8"?>
-<w:endnotes xmlns:wpc="http://schemas.microsoft.com/office/word/2010/wordprocessingCanvas" xmlns:cx="http://schemas.microsoft.com/office/drawing/2014/chartex" xmlns:cx1="http://schemas.microsoft.com/office/drawing/2015/9/8/chartex" xmlns:cx2="http://schemas.microsoft.com/office/drawing/2015/10/21/chartex" xmlns:cx3="http://schemas.microsoft.com/office/drawing/2016/5/9/chartex" xmlns:cx4="http://schemas.microsoft.com/office/drawing/2016/5/10/chartex" xmlns:cx5="http://schemas.microsoft.com/office/drawing/2016/5/11/chartex" xmlns:cx6="http://schemas.microsoft.com/office/drawing/2016/5/12/chartex" xmlns:cx7="http://schemas.microsoft.com/office/drawing/2016/5/13/chartex" xmlns:cx8="http://schemas.microsoft.com/office/drawing/2016/5/14/chartex" xmlns:mc="http://schemas.openxmlformats.org/markup-compatibility/2006" xmlns:aink="http://schemas.microsoft.com/office/drawing/2016/ink" xmlns:am3d="http://schemas.microsoft.com/office/drawing/2017/model3d" xmlns:o="urn:schemas-microsoft-com:office:office" xmlns:oel="http://schemas.microsoft.com/office/2019/extlst" xmlns:r="http://schemas.openxmlformats.org/officeDocument/2006/relationships" xmlns:m="http://schemas.openxmlformats.org/officeDocument/2006/math" xmlns:v="urn:schemas-microsoft-com:vml" xmlns:wp14="http://schemas.microsoft.com/office/word/2010/wordprocessingDrawing" xmlns:wp="http://schemas.openxmlformats.org/drawingml/2006/wordprocessingDrawing" xmlns:w10="urn:schemas-microsoft-com:office:word" xmlns:w="http://schemas.openxmlformats.org/wordprocessingml/2006/main" xmlns:w14="http://schemas.microsoft.com/office/word/2010/wordml" xmlns:w15="http://schemas.microsoft.com/office/word/2012/wordml" xmlns:w16cex="http://schemas.microsoft.com/office/word/2018/wordml/cex" xmlns:w16cid="http://schemas.microsoft.com/office/word/2016/wordml/cid" xmlns:w16="http://schemas.microsoft.com/office/word/2018/wordml" xmlns:w16sdtdh="http://schemas.microsoft.com/office/word/2020/wordml/sdtdatahash" xmlns:w16se="http://schemas.microsoft.com/office/word/2015/wordml/symex" xmlns:wpg="http://schemas.microsoft.com/office/word/2010/wordprocessingGroup" xmlns:wpi="http://schemas.microsoft.com/office/word/2010/wordprocessingInk" xmlns:wne="http://schemas.microsoft.com/office/word/2006/wordml" xmlns:wps="http://schemas.microsoft.com/office/word/2010/wordprocessingShape" mc:Ignorable="w14 w15 w16se w16cid w16 w16cex w16sdtdh wp14">
+<w:endnotes xmlns:wpc="http://schemas.microsoft.com/office/word/2010/wordprocessingCanvas" xmlns:mc="http://schemas.openxmlformats.org/markup-compatibility/2006" xmlns:o="urn:schemas-microsoft-com:office:office" xmlns:r="http://schemas.openxmlformats.org/officeDocument/2006/relationships" xmlns:m="http://schemas.openxmlformats.org/officeDocument/2006/math" xmlns:v="urn:schemas-microsoft-com:vml" xmlns:wp14="http://schemas.microsoft.com/office/word/2010/wordprocessingDrawing" xmlns:wp="http://schemas.openxmlformats.org/drawingml/2006/wordprocessingDrawing" xmlns:w10="urn:schemas-microsoft-com:office:word" xmlns:w="http://schemas.openxmlformats.org/wordprocessingml/2006/main" xmlns:w14="http://schemas.microsoft.com/office/word/2010/wordml" xmlns:w15="http://schemas.microsoft.com/office/word/2012/wordml" xmlns:wpg="http://schemas.microsoft.com/office/word/2010/wordprocessingGroup" xmlns:wpi="http://schemas.microsoft.com/office/word/2010/wordprocessingInk" xmlns:wne="http://schemas.microsoft.com/office/word/2006/wordml" xmlns:wps="http://schemas.microsoft.com/office/word/2010/wordprocessingShape" mc:Ignorable="w14 w15 wp14">
   <w:endnote w:type="separator" w:id="-1">
     <w:p>
       <w:pPr>
@@ -1480,7 +1815,7 @@
 </file>
 
 <file path=word/footnotes.xml><?xml version="1.0" encoding="utf-8"?>
-<w:footnotes xmlns:wpc="http://schemas.microsoft.com/office/word/2010/wordprocessingCanvas" xmlns:cx="http://schemas.microsoft.com/office/drawing/2014/chartex" xmlns:cx1="http://schemas.microsoft.com/office/drawing/2015/9/8/chartex" xmlns:cx2="http://schemas.microsoft.com/office/drawing/2015/10/21/chartex" xmlns:cx3="http://schemas.microsoft.com/office/drawing/2016/5/9/chartex" xmlns:cx4="http://schemas.microsoft.com/office/drawing/2016/5/10/chartex" xmlns:cx5="http://schemas.microsoft.com/office/drawing/2016/5/11/chartex" xmlns:cx6="http://schemas.microsoft.com/office/drawing/2016/5/12/chartex" xmlns:cx7="http://schemas.microsoft.com/office/drawing/2016/5/13/chartex" xmlns:cx8="http://schemas.microsoft.com/office/drawing/2016/5/14/chartex" xmlns:mc="http://schemas.openxmlformats.org/markup-compatibility/2006" xmlns:aink="http://schemas.microsoft.com/office/drawing/2016/ink" xmlns:am3d="http://schemas.microsoft.com/office/drawing/2017/model3d" xmlns:o="urn:schemas-microsoft-com:office:office" xmlns:oel="http://schemas.microsoft.com/office/2019/extlst" xmlns:r="http://schemas.openxmlformats.org/officeDocument/2006/relationships" xmlns:m="http://schemas.openxmlformats.org/officeDocument/2006/math" xmlns:v="urn:schemas-microsoft-com:vml" xmlns:wp14="http://schemas.microsoft.com/office/word/2010/wordprocessingDrawing" xmlns:wp="http://schemas.openxmlformats.org/drawingml/2006/wordprocessingDrawing" xmlns:w10="urn:schemas-microsoft-com:office:word" xmlns:w="http://schemas.openxmlformats.org/wordprocessingml/2006/main" xmlns:w14="http://schemas.microsoft.com/office/word/2010/wordml" xmlns:w15="http://schemas.microsoft.com/office/word/2012/wordml" xmlns:w16cex="http://schemas.microsoft.com/office/word/2018/wordml/cex" xmlns:w16cid="http://schemas.microsoft.com/office/word/2016/wordml/cid" xmlns:w16="http://schemas.microsoft.com/office/word/2018/wordml" xmlns:w16sdtdh="http://schemas.microsoft.com/office/word/2020/wordml/sdtdatahash" xmlns:w16se="http://schemas.microsoft.com/office/word/2015/wordml/symex" xmlns:wpg="http://schemas.microsoft.com/office/word/2010/wordprocessingGroup" xmlns:wpi="http://schemas.microsoft.com/office/word/2010/wordprocessingInk" xmlns:wne="http://schemas.microsoft.com/office/word/2006/wordml" xmlns:wps="http://schemas.microsoft.com/office/word/2010/wordprocessingShape" mc:Ignorable="w14 w15 w16se w16cid w16 w16cex w16sdtdh wp14">
+<w:footnotes xmlns:wpc="http://schemas.microsoft.com/office/word/2010/wordprocessingCanvas" xmlns:mc="http://schemas.openxmlformats.org/markup-compatibility/2006" xmlns:o="urn:schemas-microsoft-com:office:office" xmlns:r="http://schemas.openxmlformats.org/officeDocument/2006/relationships" xmlns:m="http://schemas.openxmlformats.org/officeDocument/2006/math" xmlns:v="urn:schemas-microsoft-com:vml" xmlns:wp14="http://schemas.microsoft.com/office/word/2010/wordprocessingDrawing" xmlns:wp="http://schemas.openxmlformats.org/drawingml/2006/wordprocessingDrawing" xmlns:w10="urn:schemas-microsoft-com:office:word" xmlns:w="http://schemas.openxmlformats.org/wordprocessingml/2006/main" xmlns:w14="http://schemas.microsoft.com/office/word/2010/wordml" xmlns:w15="http://schemas.microsoft.com/office/word/2012/wordml" xmlns:wpg="http://schemas.microsoft.com/office/word/2010/wordprocessingGroup" xmlns:wpi="http://schemas.microsoft.com/office/word/2010/wordprocessingInk" xmlns:wne="http://schemas.microsoft.com/office/word/2006/wordml" xmlns:wps="http://schemas.microsoft.com/office/word/2010/wordprocessingShape" mc:Ignorable="w14 w15 wp14">
   <w:footnote w:type="separator" w:id="-1">
     <w:p>
       <w:r>
@@ -1499,7 +1834,7 @@
 </file>
 
 <file path=word/numbering.xml><?xml version="1.0" encoding="utf-8"?>
-<w:numbering xmlns:wpc="http://schemas.microsoft.com/office/word/2010/wordprocessingCanvas" xmlns:cx="http://schemas.microsoft.com/office/drawing/2014/chartex" xmlns:cx1="http://schemas.microsoft.com/office/drawing/2015/9/8/chartex" xmlns:cx2="http://schemas.microsoft.com/office/drawing/2015/10/21/chartex" xmlns:cx3="http://schemas.microsoft.com/office/drawing/2016/5/9/chartex" xmlns:cx4="http://schemas.microsoft.com/office/drawing/2016/5/10/chartex" xmlns:cx5="http://schemas.microsoft.com/office/drawing/2016/5/11/chartex" xmlns:cx6="http://schemas.microsoft.com/office/drawing/2016/5/12/chartex" xmlns:cx7="http://schemas.microsoft.com/office/drawing/2016/5/13/chartex" xmlns:cx8="http://schemas.microsoft.com/office/drawing/2016/5/14/chartex" xmlns:mc="http://schemas.openxmlformats.org/markup-compatibility/2006" xmlns:aink="http://schemas.microsoft.com/office/drawing/2016/ink" xmlns:am3d="http://schemas.microsoft.com/office/drawing/2017/model3d" xmlns:o="urn:schemas-microsoft-com:office:office" xmlns:oel="http://schemas.microsoft.com/office/2019/extlst" xmlns:r="http://schemas.openxmlformats.org/officeDocument/2006/relationships" xmlns:m="http://schemas.openxmlformats.org/officeDocument/2006/math" xmlns:v="urn:schemas-microsoft-com:vml" xmlns:wp14="http://schemas.microsoft.com/office/word/2010/wordprocessingDrawing" xmlns:wp="http://schemas.openxmlformats.org/drawingml/2006/wordprocessingDrawing" xmlns:w10="urn:schemas-microsoft-com:office:word" xmlns:w="http://schemas.openxmlformats.org/wordprocessingml/2006/main" xmlns:w14="http://schemas.microsoft.com/office/word/2010/wordml" xmlns:w15="http://schemas.microsoft.com/office/word/2012/wordml" xmlns:w16cex="http://schemas.microsoft.com/office/word/2018/wordml/cex" xmlns:w16cid="http://schemas.microsoft.com/office/word/2016/wordml/cid" xmlns:w16="http://schemas.microsoft.com/office/word/2018/wordml" xmlns:w16sdtdh="http://schemas.microsoft.com/office/word/2020/wordml/sdtdatahash" xmlns:w16se="http://schemas.microsoft.com/office/word/2015/wordml/symex" xmlns:wpg="http://schemas.microsoft.com/office/word/2010/wordprocessingGroup" xmlns:wpi="http://schemas.microsoft.com/office/word/2010/wordprocessingInk" xmlns:wne="http://schemas.microsoft.com/office/word/2006/wordml" xmlns:wps="http://schemas.microsoft.com/office/word/2010/wordprocessingShape" mc:Ignorable="w14 w15 w16se w16cid w16 w16cex w16sdtdh wp14">
+<w:numbering xmlns:wpc="http://schemas.microsoft.com/office/word/2010/wordprocessingCanvas" xmlns:mc="http://schemas.openxmlformats.org/markup-compatibility/2006" xmlns:o="urn:schemas-microsoft-com:office:office" xmlns:r="http://schemas.openxmlformats.org/officeDocument/2006/relationships" xmlns:m="http://schemas.openxmlformats.org/officeDocument/2006/math" xmlns:v="urn:schemas-microsoft-com:vml" xmlns:wp14="http://schemas.microsoft.com/office/word/2010/wordprocessingDrawing" xmlns:wp="http://schemas.openxmlformats.org/drawingml/2006/wordprocessingDrawing" xmlns:w10="urn:schemas-microsoft-com:office:word" xmlns:w="http://schemas.openxmlformats.org/wordprocessingml/2006/main" xmlns:w14="http://schemas.microsoft.com/office/word/2010/wordml" xmlns:w15="http://schemas.microsoft.com/office/word/2012/wordml" xmlns:wpg="http://schemas.microsoft.com/office/word/2010/wordprocessingGroup" xmlns:wpi="http://schemas.microsoft.com/office/word/2010/wordprocessingInk" xmlns:wne="http://schemas.microsoft.com/office/word/2006/wordml" xmlns:wps="http://schemas.microsoft.com/office/word/2010/wordprocessingShape" mc:Ignorable="w14 w15 wp14">
   <w:abstractNum w:abstractNumId="0" w15:restartNumberingAfterBreak="0">
     <w:nsid w:val="0000A990"/>
     <w:multiLevelType w:val="multilevel"/>
@@ -2256,40 +2591,40 @@
       </w:pPr>
     </w:lvl>
   </w:abstractNum>
-  <w:num w:numId="1" w16cid:durableId="534583906">
+  <w:num w:numId="1">
     <w:abstractNumId w:val="0"/>
   </w:num>
-  <w:num w:numId="2" w16cid:durableId="662046103">
+  <w:num w:numId="2">
     <w:abstractNumId w:val="1"/>
   </w:num>
-  <w:num w:numId="3" w16cid:durableId="1366523612">
+  <w:num w:numId="3">
     <w:abstractNumId w:val="1"/>
   </w:num>
-  <w:num w:numId="4" w16cid:durableId="104466033">
+  <w:num w:numId="4">
     <w:abstractNumId w:val="1"/>
   </w:num>
-  <w:num w:numId="5" w16cid:durableId="417214436">
+  <w:num w:numId="5">
     <w:abstractNumId w:val="1"/>
   </w:num>
-  <w:num w:numId="6" w16cid:durableId="302857923">
+  <w:num w:numId="6">
     <w:abstractNumId w:val="1"/>
   </w:num>
-  <w:num w:numId="7" w16cid:durableId="142429650">
+  <w:num w:numId="7">
     <w:abstractNumId w:val="1"/>
   </w:num>
-  <w:num w:numId="8" w16cid:durableId="1978487581">
+  <w:num w:numId="8">
     <w:abstractNumId w:val="1"/>
   </w:num>
-  <w:num w:numId="9" w16cid:durableId="1676763873">
+  <w:num w:numId="9">
     <w:abstractNumId w:val="1"/>
   </w:num>
-  <w:num w:numId="10" w16cid:durableId="1440448098">
+  <w:num w:numId="10">
     <w:abstractNumId w:val="1"/>
   </w:num>
-  <w:num w:numId="11" w16cid:durableId="225722528">
+  <w:num w:numId="11">
     <w:abstractNumId w:val="1"/>
   </w:num>
-  <w:num w:numId="12" w16cid:durableId="614606457">
+  <w:num w:numId="12">
     <w:abstractNumId w:val="2"/>
     <w:lvlOverride w:ilvl="0">
       <w:startOverride w:val="1"/>
@@ -2319,7 +2654,7 @@
       <w:startOverride w:val="1"/>
     </w:lvlOverride>
   </w:num>
-  <w:num w:numId="13" w16cid:durableId="311449876">
+  <w:num w:numId="13">
     <w:abstractNumId w:val="3"/>
     <w:lvlOverride w:ilvl="0">
       <w:startOverride w:val="2"/>
@@ -2349,7 +2684,7 @@
       <w:startOverride w:val="2"/>
     </w:lvlOverride>
   </w:num>
-  <w:num w:numId="14" w16cid:durableId="1879511200">
+  <w:num w:numId="14">
     <w:abstractNumId w:val="4"/>
     <w:lvlOverride w:ilvl="0">
       <w:startOverride w:val="3"/>
@@ -2379,7 +2714,7 @@
       <w:startOverride w:val="3"/>
     </w:lvlOverride>
   </w:num>
-  <w:num w:numId="15" w16cid:durableId="1144586756">
+  <w:num w:numId="15">
     <w:abstractNumId w:val="5"/>
     <w:lvlOverride w:ilvl="0">
       <w:startOverride w:val="4"/>
@@ -2409,7 +2744,7 @@
       <w:startOverride w:val="4"/>
     </w:lvlOverride>
   </w:num>
-  <w:num w:numId="16" w16cid:durableId="204223909">
+  <w:num w:numId="16">
     <w:abstractNumId w:val="6"/>
     <w:lvlOverride w:ilvl="0">
       <w:startOverride w:val="5"/>
@@ -2439,7 +2774,7 @@
       <w:startOverride w:val="5"/>
     </w:lvlOverride>
   </w:num>
-  <w:num w:numId="17" w16cid:durableId="1911770043">
+  <w:num w:numId="17">
     <w:abstractNumId w:val="7"/>
     <w:lvlOverride w:ilvl="0">
       <w:startOverride w:val="6"/>
@@ -2469,7 +2804,7 @@
       <w:startOverride w:val="6"/>
     </w:lvlOverride>
   </w:num>
-  <w:num w:numId="18" w16cid:durableId="890968978">
+  <w:num w:numId="18">
     <w:abstractNumId w:val="8"/>
     <w:lvlOverride w:ilvl="0">
       <w:startOverride w:val="7"/>
@@ -2499,10 +2834,10 @@
       <w:startOverride w:val="7"/>
     </w:lvlOverride>
   </w:num>
-  <w:num w:numId="19" w16cid:durableId="981812363">
+  <w:num w:numId="19">
     <w:abstractNumId w:val="1"/>
   </w:num>
-  <w:num w:numId="20" w16cid:durableId="1676225662">
+  <w:num w:numId="20">
     <w:abstractNumId w:val="2"/>
     <w:lvlOverride w:ilvl="0">
       <w:startOverride w:val="1"/>
@@ -2532,7 +2867,7 @@
       <w:startOverride w:val="1"/>
     </w:lvlOverride>
   </w:num>
-  <w:num w:numId="21" w16cid:durableId="221328973">
+  <w:num w:numId="21">
     <w:abstractNumId w:val="3"/>
     <w:lvlOverride w:ilvl="0">
       <w:startOverride w:val="2"/>
@@ -2562,7 +2897,7 @@
       <w:startOverride w:val="2"/>
     </w:lvlOverride>
   </w:num>
-  <w:num w:numId="22" w16cid:durableId="148526716">
+  <w:num w:numId="22">
     <w:abstractNumId w:val="4"/>
     <w:lvlOverride w:ilvl="0">
       <w:startOverride w:val="3"/>
@@ -2596,7 +2931,7 @@
 </file>
 
 <file path=word/styles.xml><?xml version="1.0" encoding="utf-8"?>
-<w:styles xmlns:mc="http://schemas.openxmlformats.org/markup-compatibility/2006" xmlns:r="http://schemas.openxmlformats.org/officeDocument/2006/relationships" xmlns:w="http://schemas.openxmlformats.org/wordprocessingml/2006/main" xmlns:w14="http://schemas.microsoft.com/office/word/2010/wordml" xmlns:w15="http://schemas.microsoft.com/office/word/2012/wordml" xmlns:w16cex="http://schemas.microsoft.com/office/word/2018/wordml/cex" xmlns:w16cid="http://schemas.microsoft.com/office/word/2016/wordml/cid" xmlns:w16="http://schemas.microsoft.com/office/word/2018/wordml" xmlns:w16sdtdh="http://schemas.microsoft.com/office/word/2020/wordml/sdtdatahash" xmlns:w16se="http://schemas.microsoft.com/office/word/2015/wordml/symex" mc:Ignorable="w14 w15 w16se w16cid w16 w16cex w16sdtdh">
+<w:styles xmlns:mc="http://schemas.openxmlformats.org/markup-compatibility/2006" xmlns:r="http://schemas.openxmlformats.org/officeDocument/2006/relationships" xmlns:w="http://schemas.openxmlformats.org/wordprocessingml/2006/main" xmlns:w14="http://schemas.microsoft.com/office/word/2010/wordml" xmlns:w15="http://schemas.microsoft.com/office/word/2012/wordml" mc:Ignorable="w14 w15">
   <w:docDefaults>
     <w:rPrDefault>
       <w:rPr>
@@ -2612,7 +2947,7 @@
       </w:pPr>
     </w:pPrDefault>
   </w:docDefaults>
-  <w:latentStyles w:defLockedState="0" w:defUIPriority="0" w:defSemiHidden="0" w:defUnhideWhenUsed="0" w:defQFormat="0" w:count="376">
+  <w:latentStyles w:defLockedState="0" w:defUIPriority="0" w:defSemiHidden="0" w:defUnhideWhenUsed="0" w:defQFormat="0" w:count="371">
     <w:lsdException w:name="Normal Table" w:semiHidden="1" w:unhideWhenUsed="1"/>
     <w:lsdException w:name="Table Simple 1" w:semiHidden="1" w:unhideWhenUsed="1"/>
     <w:lsdException w:name="Table Simple 2" w:semiHidden="1" w:unhideWhenUsed="1"/>
@@ -2850,11 +3185,6 @@
     <w:lsdException w:name="List Table 5 Dark Accent 6" w:uiPriority="50"/>
     <w:lsdException w:name="List Table 6 Colorful Accent 6" w:uiPriority="51"/>
     <w:lsdException w:name="List Table 7 Colorful Accent 6" w:uiPriority="52"/>
-    <w:lsdException w:name="Mention" w:semiHidden="1" w:uiPriority="99" w:unhideWhenUsed="1"/>
-    <w:lsdException w:name="Smart Hyperlink" w:semiHidden="1" w:uiPriority="99" w:unhideWhenUsed="1"/>
-    <w:lsdException w:name="Hashtag" w:semiHidden="1" w:uiPriority="99" w:unhideWhenUsed="1"/>
-    <w:lsdException w:name="Unresolved Mention" w:semiHidden="1" w:uiPriority="99" w:unhideWhenUsed="1"/>
-    <w:lsdException w:name="Smart Link" w:semiHidden="1" w:uiPriority="99" w:unhideWhenUsed="1"/>
   </w:latentStyles>
   <w:style w:type="paragraph" w:default="1" w:styleId="Normal">
     <w:name w:val="Normal"/>

</xml_diff>